<commit_message>
Update labs to new structure (Lab00-11), add Outlook/Teams, appendices, capstone, and switch to light theme
</commit_message>
<xml_diff>
--- a/docs/assets/00_Training_Pack_Inventory_and_Exercise_Map.docx
+++ b/docs/assets/00_Training_Pack_Inventory_and_Exercise_Map.docx
@@ -2,17 +2,20 @@
 <file path=word/document.xml><?xml version="1.0" encoding="utf-8"?>
 <w:document xmlns:wpc="http://schemas.microsoft.com/office/word/2010/wordprocessingCanvas" xmlns:mo="http://schemas.microsoft.com/office/mac/office/2008/main" xmlns:mc="http://schemas.openxmlformats.org/markup-compatibility/2006" xmlns:mv="urn:schemas-microsoft-com:mac:vml" xmlns:o="urn:schemas-microsoft-com:office:office" xmlns:r="http://schemas.openxmlformats.org/officeDocument/2006/relationships" xmlns:m="http://schemas.openxmlformats.org/officeDocument/2006/math" xmlns:v="urn:schemas-microsoft-com:vml" xmlns:wp14="http://schemas.microsoft.com/office/word/2010/wordprocessingDrawing" xmlns:wp="http://schemas.openxmlformats.org/drawingml/2006/wordprocessingDrawing" xmlns:w10="urn:schemas-microsoft-com:office:word" xmlns:w="http://schemas.openxmlformats.org/wordprocessingml/2006/main" xmlns:w14="http://schemas.microsoft.com/office/word/2010/wordml" xmlns:wpg="http://schemas.microsoft.com/office/word/2010/wordprocessingGroup" xmlns:wpi="http://schemas.microsoft.com/office/word/2010/wordprocessingInk" xmlns:wne="http://schemas.microsoft.com/office/word/2006/wordml" xmlns:wps="http://schemas.microsoft.com/office/word/2010/wordprocessingShape" mc:Ignorable="w14 wp14">
   <w:body>
-    <w:p xmlns:wp14="http://schemas.microsoft.com/office/word/2010/wordml" wp14:textId="77777777">
+    <w:p>
       <w:pPr>
+        <w:pStyle w:val="Normal"/>
         <w:jc w:val="center"/>
       </w:pPr>
       <w:r>
         <w:rPr>
-          <w:b/>
+          <w:b w:val="1"/>
+          <w:bCs w:val="1"/>
           <w:color w:val="0B3D2E"/>
           <w:sz w:val="48"/>
+          <w:szCs w:val="48"/>
         </w:rPr>
-        <w:t>BP Malaysia Copilot Training Mock Document Pack</w:t>
+        <w:t>Contoso Energy Copilot Training Mock Document Pack</w:t>
       </w:r>
     </w:p>
     <w:p xmlns:wp14="http://schemas.microsoft.com/office/word/2010/wordml" wp14:textId="77777777">
@@ -42,6 +45,8 @@
         <w:tc>
           <w:tcPr>
             <w:tcW w:w="5184" w:type="dxa"/>
+            <w:shd w:val="clear" w:color="auto" w:fill="0B3D2E"/>
+            <w:tcMar/>
             <w:vAlign w:val="center"/>
             <w:shd w:fill="0B3D2E"/>
           </w:tcPr>
@@ -60,6 +65,7 @@
         <w:tc>
           <w:tcPr>
             <w:tcW w:w="5184" w:type="dxa"/>
+            <w:tcMar/>
             <w:vAlign w:val="center"/>
           </w:tcPr>
           <w:p wp14:textId="77777777">
@@ -79,6 +85,8 @@
         <w:tc>
           <w:tcPr>
             <w:tcW w:w="5184" w:type="dxa"/>
+            <w:shd w:val="clear" w:color="auto" w:fill="0B3D2E"/>
+            <w:tcMar/>
             <w:vAlign w:val="center"/>
             <w:shd w:fill="0B3D2E"/>
           </w:tcPr>
@@ -97,6 +105,7 @@
         <w:tc>
           <w:tcPr>
             <w:tcW w:w="5184" w:type="dxa"/>
+            <w:tcMar/>
             <w:vAlign w:val="center"/>
           </w:tcPr>
           <w:p wp14:textId="77777777">
@@ -116,6 +125,8 @@
         <w:tc>
           <w:tcPr>
             <w:tcW w:w="5184" w:type="dxa"/>
+            <w:shd w:val="clear" w:color="auto" w:fill="0B3D2E"/>
+            <w:tcMar/>
             <w:vAlign w:val="center"/>
             <w:shd w:fill="0B3D2E"/>
           </w:tcPr>
@@ -134,6 +145,7 @@
         <w:tc>
           <w:tcPr>
             <w:tcW w:w="5184" w:type="dxa"/>
+            <w:tcMar/>
             <w:vAlign w:val="center"/>
           </w:tcPr>
           <w:p wp14:textId="77777777">
@@ -153,6 +165,8 @@
         <w:tc>
           <w:tcPr>
             <w:tcW w:w="5184" w:type="dxa"/>
+            <w:shd w:val="clear" w:color="auto" w:fill="0B3D2E"/>
+            <w:tcMar/>
             <w:vAlign w:val="center"/>
             <w:shd w:fill="0B3D2E"/>
           </w:tcPr>
@@ -171,6 +185,7 @@
         <w:tc>
           <w:tcPr>
             <w:tcW w:w="5184" w:type="dxa"/>
+            <w:tcMar/>
             <w:vAlign w:val="center"/>
           </w:tcPr>
           <w:p wp14:textId="77777777">
@@ -187,9 +202,13 @@
         </w:tc>
       </w:tr>
     </w:tbl>
-    <w:p xmlns:wp14="http://schemas.microsoft.com/office/word/2010/wordml" wp14:textId="77777777">
+    <w:p>
+      <w:pPr>
+        <w:pStyle w:val="Normal"/>
+      </w:pPr>
       <w:r>
-        <w:t>Synthetic training data only. No real BP confidential information, logos, contracts, financials, employee records, or production data are included.</w:t>
+        <w:rPr/>
+        <w:t>Synthetic training data only. No real Contoso Energy confidential information, logos, contracts, financials, employee records, or production data are included.</w:t>
       </w:r>
     </w:p>
     <w:p xmlns:wp14="http://schemas.microsoft.com/office/word/2010/wordml" wp14:textId="77777777">
@@ -197,12 +216,17 @@
         <w:pStyle w:val="Heading1"/>
       </w:pPr>
       <w:r>
+        <w:rPr/>
         <w:t>How to Use This Pack</w:t>
       </w:r>
     </w:p>
-    <w:p xmlns:wp14="http://schemas.microsoft.com/office/word/2010/wordml" wp14:textId="77777777">
+    <w:p>
+      <w:pPr>
+        <w:pStyle w:val="Normal"/>
+      </w:pPr>
       <w:r>
-        <w:t>Store these files in your OneDrive folder named Bp copilot. Keep the folder private to the training class and explain that all files are synthetic. The style intentionally avoids copying real BP brand assets, logos or proprietary templates while still using a clean energy-sector visual language suitable for Malaysia-based exercises.</w:t>
+        <w:rPr/>
+        <w:t>Store these files in your OneDrive folder named Contoso Energy Copilot. Keep the folder private to the training class and explain that all files are synthetic. The style intentionally avoids copying real company brand assets, logos or proprietary templates while still using a clean energy-sector visual language suitable for oil and gas exercises.</w:t>
       </w:r>
     </w:p>
     <w:p xmlns:wp14="http://schemas.microsoft.com/office/word/2010/wordml" wp14:textId="77777777">
@@ -940,7 +964,7 @@
 
 <file path=word/footer1.xml><?xml version="1.0" encoding="utf-8"?>
 <w:ftr xmlns:m="http://schemas.openxmlformats.org/officeDocument/2006/math" xmlns:mc="http://schemas.openxmlformats.org/markup-compatibility/2006" xmlns:mo="http://schemas.microsoft.com/office/mac/office/2008/main" xmlns:mv="urn:schemas-microsoft-com:mac:vml" xmlns:o="urn:schemas-microsoft-com:office:office" xmlns:r="http://schemas.openxmlformats.org/officeDocument/2006/relationships" xmlns:v="urn:schemas-microsoft-com:vml" xmlns:w10="urn:schemas-microsoft-com:office:word" xmlns:w14="http://schemas.microsoft.com/office/word/2010/wordml" xmlns:w="http://schemas.openxmlformats.org/wordprocessingml/2006/main" xmlns:wne="http://schemas.microsoft.com/office/word/2006/wordml" xmlns:wp14="http://schemas.microsoft.com/office/word/2010/wordprocessingDrawing" xmlns:wp="http://schemas.openxmlformats.org/drawingml/2006/wordprocessingDrawing" xmlns:wpc="http://schemas.microsoft.com/office/word/2010/wordprocessingCanvas" xmlns:wpg="http://schemas.microsoft.com/office/word/2010/wordprocessingGroup" xmlns:wpi="http://schemas.microsoft.com/office/word/2010/wordprocessingInk" xmlns:wps="http://schemas.microsoft.com/office/word/2010/wordprocessingShape" mc:Ignorable="w14 wp14">
-  <w:p xmlns:wp14="http://schemas.microsoft.com/office/word/2010/wordml" wp14:textId="77777777">
+  <w:p>
     <w:pPr>
       <w:pStyle w:val="Footer"/>
     </w:pPr>
@@ -948,8 +972,9 @@
       <w:rPr>
         <w:color w:val="5A5A5A"/>
         <w:sz w:val="14"/>
-      </w:rPr>
-      <w:t>Synthetic training data only. No real BP confidential information, logos, contracts, financials, employee records, or production data are included.</w:t>
+        <w:szCs w:val="14"/>
+      </w:rPr>
+      <w:t>Synthetic training data only. No real Contoso Energy confidential information, logos, contracts, financials, employee records, or production data are included.</w:t>
     </w:r>
   </w:p>
 </w:ftr>
@@ -957,7 +982,7 @@
 
 <file path=word/header1.xml><?xml version="1.0" encoding="utf-8"?>
 <w:hdr xmlns:m="http://schemas.openxmlformats.org/officeDocument/2006/math" xmlns:mc="http://schemas.openxmlformats.org/markup-compatibility/2006" xmlns:mo="http://schemas.microsoft.com/office/mac/office/2008/main" xmlns:mv="urn:schemas-microsoft-com:mac:vml" xmlns:o="urn:schemas-microsoft-com:office:office" xmlns:r="http://schemas.openxmlformats.org/officeDocument/2006/relationships" xmlns:v="urn:schemas-microsoft-com:vml" xmlns:w10="urn:schemas-microsoft-com:office:word" xmlns:w14="http://schemas.microsoft.com/office/word/2010/wordml" xmlns:w="http://schemas.openxmlformats.org/wordprocessingml/2006/main" xmlns:wne="http://schemas.microsoft.com/office/word/2006/wordml" xmlns:wp14="http://schemas.microsoft.com/office/word/2010/wordprocessingDrawing" xmlns:wp="http://schemas.openxmlformats.org/drawingml/2006/wordprocessingDrawing" xmlns:wpc="http://schemas.microsoft.com/office/word/2010/wordprocessingCanvas" xmlns:wpg="http://schemas.microsoft.com/office/word/2010/wordprocessingGroup" xmlns:wpi="http://schemas.microsoft.com/office/word/2010/wordprocessingInk" xmlns:wps="http://schemas.microsoft.com/office/word/2010/wordprocessingShape" mc:Ignorable="w14 wp14">
-  <w:p xmlns:wp14="http://schemas.microsoft.com/office/word/2010/wordml" wp14:textId="77777777">
+  <w:p>
     <w:pPr>
       <w:pStyle w:val="Header"/>
     </w:pPr>
@@ -965,8 +990,9 @@
       <w:rPr>
         <w:color w:val="1F2933"/>
         <w:sz w:val="16"/>
-      </w:rPr>
-      <w:t>BP Malaysia Mock Training | README | Mock dataset</w:t>
+        <w:szCs w:val="16"/>
+      </w:rPr>
+      <w:t>Contoso Energy Mock Training | README | Mock dataset</w:t>
     </w:r>
   </w:p>
 </w:hdr>

</xml_diff>